<commit_message>
Step by step now has a working installer for Mongodb
</commit_message>
<xml_diff>
--- a/Step-by-step.docx
+++ b/Step-by-step.docx
@@ -1,6 +1,6 @@
 
 <file path=word/document.xml><?xml version="1.0" encoding="utf-8"?>
-<w:document xmlns:wpc="http://schemas.microsoft.com/office/word/2010/wordprocessingCanvas" xmlns:cx="http://schemas.microsoft.com/office/drawing/2014/chartex" xmlns:cx1="http://schemas.microsoft.com/office/drawing/2015/9/8/chartex" xmlns:cx2="http://schemas.microsoft.com/office/drawing/2015/10/21/chartex" xmlns:cx3="http://schemas.microsoft.com/office/drawing/2016/5/9/chartex" xmlns:cx4="http://schemas.microsoft.com/office/drawing/2016/5/10/chartex" xmlns:cx5="http://schemas.microsoft.com/office/drawing/2016/5/11/chartex" xmlns:cx6="http://schemas.microsoft.com/office/drawing/2016/5/12/chartex" xmlns:cx7="http://schemas.microsoft.com/office/drawing/2016/5/13/chartex" xmlns:cx8="http://schemas.microsoft.com/office/drawing/2016/5/14/chartex" xmlns:mc="http://schemas.openxmlformats.org/markup-compatibility/2006" xmlns:aink="http://schemas.microsoft.com/office/drawing/2016/ink" xmlns:am3d="http://schemas.microsoft.com/office/drawing/2017/model3d" xmlns:o="urn:schemas-microsoft-com:office:office" xmlns:oel="http://schemas.microsoft.com/office/2019/extlst" xmlns:r="http://schemas.openxmlformats.org/officeDocument/2006/relationships" xmlns:m="http://schemas.openxmlformats.org/officeDocument/2006/math" xmlns:v="urn:schemas-microsoft-com:vml" xmlns:wp14="http://schemas.microsoft.com/office/word/2010/wordprocessingDrawing" xmlns:wp="http://schemas.openxmlformats.org/drawingml/2006/wordprocessingDrawing" xmlns:w10="urn:schemas-microsoft-com:office:word" xmlns:w="http://schemas.openxmlformats.org/wordprocessingml/2006/main" xmlns:w14="http://schemas.microsoft.com/office/word/2010/wordml" xmlns:w15="http://schemas.microsoft.com/office/word/2012/wordml" xmlns:w16cex="http://schemas.microsoft.com/office/word/2018/wordml/cex" xmlns:w16cid="http://schemas.microsoft.com/office/word/2016/wordml/cid" xmlns:w16="http://schemas.microsoft.com/office/word/2018/wordml" xmlns:w16du="http://schemas.microsoft.com/office/word/2023/wordml/word16du" xmlns:w16sdtdh="http://schemas.microsoft.com/office/word/2020/wordml/sdtdatahash" xmlns:w16sdtfl="http://schemas.microsoft.com/office/word/2024/wordml/sdtformatlock" xmlns:w16se="http://schemas.microsoft.com/office/word/2015/wordml/symex" xmlns:wpg="http://schemas.microsoft.com/office/word/2010/wordprocessingGroup" xmlns:wpi="http://schemas.microsoft.com/office/word/2010/wordprocessingInk" xmlns:wne="http://schemas.microsoft.com/office/word/2006/wordml" xmlns:wps="http://schemas.microsoft.com/office/word/2010/wordprocessingShape" mc:Ignorable="w14 w15 w16se w16cid w16 w16cex w16sdtdh w16sdtfl w16du wp14">
+<w:document xmlns:wpc="http://schemas.microsoft.com/office/word/2010/wordprocessingCanvas" xmlns:cx="http://schemas.microsoft.com/office/drawing/2014/chartex" xmlns:cx1="http://schemas.microsoft.com/office/drawing/2015/9/8/chartex" xmlns:cx2="http://schemas.microsoft.com/office/drawing/2015/10/21/chartex" xmlns:cx3="http://schemas.microsoft.com/office/drawing/2016/5/9/chartex" xmlns:cx4="http://schemas.microsoft.com/office/drawing/2016/5/10/chartex" xmlns:cx5="http://schemas.microsoft.com/office/drawing/2016/5/11/chartex" xmlns:cx6="http://schemas.microsoft.com/office/drawing/2016/5/12/chartex" xmlns:cx7="http://schemas.microsoft.com/office/drawing/2016/5/13/chartex" xmlns:cx8="http://schemas.microsoft.com/office/drawing/2016/5/14/chartex" xmlns:mc="http://schemas.openxmlformats.org/markup-compatibility/2006" xmlns:aink="http://schemas.microsoft.com/office/drawing/2016/ink" xmlns:am3d="http://schemas.microsoft.com/office/drawing/2017/model3d" xmlns:o="urn:schemas-microsoft-com:office:office" xmlns:oel="http://schemas.microsoft.com/office/2019/extlst" xmlns:r="http://schemas.openxmlformats.org/officeDocument/2006/relationships" xmlns:m="http://schemas.openxmlformats.org/officeDocument/2006/math" xmlns:v="urn:schemas-microsoft-com:vml" xmlns:wp14="http://schemas.microsoft.com/office/word/2010/wordprocessingDrawing" xmlns:wp="http://schemas.openxmlformats.org/drawingml/2006/wordprocessingDrawing" xmlns:w10="urn:schemas-microsoft-com:office:word" xmlns:w="http://schemas.openxmlformats.org/wordprocessingml/2006/main" xmlns:w14="http://schemas.microsoft.com/office/word/2010/wordml" xmlns:w15="http://schemas.microsoft.com/office/word/2012/wordml" xmlns:w16cei="http://schemas.microsoft.com/office/word/2026/wordml/cei" xmlns:w16cex="http://schemas.microsoft.com/office/word/2018/wordml/cex" xmlns:w16cid="http://schemas.microsoft.com/office/word/2016/wordml/cid" xmlns:w16="http://schemas.microsoft.com/office/word/2018/wordml" xmlns:w16du="http://schemas.microsoft.com/office/word/2023/wordml/word16du" xmlns:w16sdtdh="http://schemas.microsoft.com/office/word/2020/wordml/sdtdatahash" xmlns:w16sdtfl="http://schemas.microsoft.com/office/word/2024/wordml/sdtformatlock" xmlns:w16se="http://schemas.microsoft.com/office/word/2015/wordml/symex" xmlns:wpg="http://schemas.microsoft.com/office/word/2010/wordprocessingGroup" xmlns:wpi="http://schemas.microsoft.com/office/word/2010/wordprocessingInk" xmlns:wne="http://schemas.microsoft.com/office/word/2006/wordml" xmlns:wps="http://schemas.microsoft.com/office/word/2010/wordprocessingShape" mc:Ignorable="w14 w15 w16se w16cid w16 w16cex w16sdtdh w16sdtfl w16du wp14">
   <w:body>
     <w:p>
       <w:pPr>
@@ -17,11 +17,20 @@
     <w:p>
       <w:pPr>
         <w:pStyle w:val="code"/>
-      </w:pPr>
-      <w:r>
+        <w:rPr>
+          <w:lang w:val="fr-BE"/>
+        </w:rPr>
+      </w:pPr>
+      <w:r>
+        <w:rPr>
+          <w:lang w:val="fr-BE"/>
+        </w:rPr>
         <w:t xml:space="preserve"># </w:t>
       </w:r>
       <w:r>
+        <w:rPr>
+          <w:lang w:val="fr-BE"/>
+        </w:rPr>
         <w:t>nano /etc/sudoers.d/90-cloud-init-users</w:t>
       </w:r>
     </w:p>
@@ -151,12 +160,15 @@
     <w:p>
       <w:pPr>
         <w:pStyle w:val="code"/>
-      </w:pPr>
-      <w:r>
-        <w:t xml:space="preserve"># </w:t>
-      </w:r>
-      <w:r>
-        <w:t>nano /etc/nginx/sites-available/wss</w:t>
+        <w:rPr>
+          <w:lang w:val="fr-BE"/>
+        </w:rPr>
+      </w:pPr>
+      <w:r>
+        <w:rPr>
+          <w:lang w:val="fr-BE"/>
+        </w:rPr>
+        <w:t># nano /etc/nginx/sites-available/wss</w:t>
       </w:r>
     </w:p>
     <w:p>
@@ -627,17 +639,28 @@
     <w:p>
       <w:pPr>
         <w:pStyle w:val="code"/>
-      </w:pPr>
-      <w:r>
-        <w:t>#</w:t>
-      </w:r>
-      <w:r>
-        <w:t xml:space="preserve"> nano /etc/nginx/sites-available/wss</w:t>
-      </w:r>
-    </w:p>
-    <w:p>
-      <w:r>
-        <w:t>Add the proxy to /ws/</w:t>
+        <w:rPr>
+          <w:lang w:val="fr-BE"/>
+        </w:rPr>
+      </w:pPr>
+      <w:r>
+        <w:rPr>
+          <w:lang w:val="fr-BE"/>
+        </w:rPr>
+        <w:t># nano /etc/nginx/sites-available/wss</w:t>
+      </w:r>
+    </w:p>
+    <w:p>
+      <w:r>
+        <w:t>Add the proxy to /</w:t>
+      </w:r>
+      <w:proofErr w:type="spellStart"/>
+      <w:r>
+        <w:t>ws</w:t>
+      </w:r>
+      <w:proofErr w:type="spellEnd"/>
+      <w:r>
+        <w:t>/</w:t>
       </w:r>
     </w:p>
     <w:p>
@@ -757,12 +780,15 @@
     <w:p>
       <w:pPr>
         <w:pStyle w:val="code"/>
-      </w:pPr>
-      <w:r>
-        <w:t xml:space="preserve"># </w:t>
-      </w:r>
-      <w:r>
-        <w:t>nano /etc/php/8.3/fpm/php.ini</w:t>
+        <w:rPr>
+          <w:lang w:val="fr-BE"/>
+        </w:rPr>
+      </w:pPr>
+      <w:r>
+        <w:rPr>
+          <w:lang w:val="fr-BE"/>
+        </w:rPr>
+        <w:t># nano /etc/php/8.3/fpm/php.ini</w:t>
       </w:r>
     </w:p>
     <w:p>
@@ -790,7 +816,15 @@
         <w:pStyle w:val="Heading2"/>
       </w:pPr>
       <w:r>
-        <w:t>Set up ReactPHP WebSocket</w:t>
+        <w:t xml:space="preserve">Set up </w:t>
+      </w:r>
+      <w:proofErr w:type="spellStart"/>
+      <w:r>
+        <w:t>ReactPHP</w:t>
+      </w:r>
+      <w:proofErr w:type="spellEnd"/>
+      <w:r>
+        <w:t xml:space="preserve"> WebSocket</w:t>
       </w:r>
     </w:p>
     <w:p>
@@ -856,182 +890,42 @@
         <w:pStyle w:val="code"/>
       </w:pPr>
       <w:r>
-        <w:t xml:space="preserve"># apt install </w:t>
-      </w:r>
-      <w:r>
-        <w:t>gnupg curl</w:t>
-      </w:r>
-    </w:p>
-    <w:p>
-      <w:pPr>
-        <w:pStyle w:val="code"/>
-      </w:pPr>
-      <w:r>
-        <w:t xml:space="preserve">~/$ </w:t>
-      </w:r>
-      <w:r>
-        <w:t>echo "deb [ arch=amd64,arm64 signed-by=/usr/share/keyrings/mongodb-server-8.0.gpg ] https://repo.mongodb.org/apt/ubuntu noble/mongodb-org/8.2 multiverse" | sudo tee /etc/apt/sources.list.d/mongodb-org-8.2.list</w:t>
-      </w:r>
-    </w:p>
-    <w:p>
-      <w:pPr>
-        <w:pStyle w:val="code"/>
-      </w:pPr>
-      <w:r>
-        <w:t># apt update</w:t>
-      </w:r>
-    </w:p>
-    <w:p>
-      <w:pPr>
-        <w:pStyle w:val="code"/>
-      </w:pPr>
-      <w:r>
-        <w:t xml:space="preserve"># apt install -y </w:t>
-      </w:r>
-      <w:r>
-        <w:t>mongodb-org</w:t>
-      </w:r>
-    </w:p>
-    <w:p>
-      <w:r>
-        <w:t xml:space="preserve">Check </w:t>
-      </w:r>
-      <w:hyperlink r:id="rId6" w:history="1">
-        <w:r>
-          <w:rPr>
-            <w:rStyle w:val="Hyperlink"/>
-          </w:rPr>
-          <w:t>here</w:t>
-        </w:r>
-      </w:hyperlink>
-      <w:r>
-        <w:t xml:space="preserve"> if it gets a startup warning</w:t>
-      </w:r>
-    </w:p>
-    <w:p>
-      <w:pPr>
-        <w:pStyle w:val="code"/>
-      </w:pPr>
-      <w:r>
-        <w:t xml:space="preserve"># </w:t>
-      </w:r>
-      <w:r>
-        <w:t>systemctl start mongod</w:t>
-      </w:r>
-    </w:p>
-    <w:p>
-      <w:pPr>
-        <w:pStyle w:val="code"/>
-      </w:pPr>
-      <w:r>
-        <w:t xml:space="preserve"># </w:t>
-      </w:r>
-      <w:r>
-        <w:t>systemctl daemon-reload</w:t>
-      </w:r>
-    </w:p>
-    <w:p>
-      <w:pPr>
-        <w:pStyle w:val="code"/>
-      </w:pPr>
-      <w:r>
-        <w:t xml:space="preserve"># </w:t>
-      </w:r>
-      <w:r>
-        <w:t>systemctl enable mongod</w:t>
-      </w:r>
-    </w:p>
-    <w:p>
-      <w:pPr>
-        <w:pStyle w:val="Heading3"/>
-        <w:ind w:left="720"/>
-      </w:pPr>
-      <w:r>
-        <w:lastRenderedPageBreak/>
-        <w:t xml:space="preserve">Install PIE (see </w:t>
-      </w:r>
-      <w:r>
-        <w:t>https://github.com/php/pie</w:t>
-      </w:r>
-      <w:r>
-        <w:t>)</w:t>
-      </w:r>
-    </w:p>
-    <w:p>
-      <w:pPr>
-        <w:pStyle w:val="code"/>
-        <w:ind w:left="720"/>
-      </w:pPr>
-      <w:r>
-        <w:t>~/$ curl -fL --output /tmp/pie.phar https://github.com/php/pie/releases/latest/download/pie.phar \</w:t>
-      </w:r>
-    </w:p>
-    <w:p>
-      <w:pPr>
-        <w:pStyle w:val="code"/>
-        <w:ind w:left="720"/>
-      </w:pPr>
-      <w:r>
-        <w:t xml:space="preserve">  &amp;&amp; sudo mv /tmp/pie.phar /usr/local/bin/pie \</w:t>
-      </w:r>
-    </w:p>
-    <w:p>
-      <w:pPr>
-        <w:pStyle w:val="code"/>
-        <w:ind w:left="720"/>
-      </w:pPr>
-      <w:r>
-        <w:t xml:space="preserve">  &amp;&amp; sudo chmod +x /usr/local/bin/pie</w:t>
-      </w:r>
-    </w:p>
-    <w:p>
-      <w:pPr>
-        <w:pStyle w:val="code"/>
-      </w:pPr>
-    </w:p>
-    <w:p>
-      <w:pPr>
-        <w:pStyle w:val="code"/>
-      </w:pPr>
-      <w:r>
-        <w:t xml:space="preserve"># </w:t>
-      </w:r>
-      <w:r>
-        <w:t>pie install mongodb/mongodb-extension</w:t>
-      </w:r>
-    </w:p>
-    <w:p>
-      <w:pPr>
-        <w:pStyle w:val="code"/>
-      </w:pPr>
-      <w:r>
-        <w:t xml:space="preserve">~/wss/ws$ </w:t>
-      </w:r>
-      <w:r>
-        <w:t>composer require</w:t>
-      </w:r>
-      <w:r>
-        <w:t xml:space="preserve"> </w:t>
-      </w:r>
-      <w:r>
-        <w:t>mongodb/mongodb</w:t>
-      </w:r>
-    </w:p>
-    <w:p>
-      <w:pPr>
-        <w:pStyle w:val="code"/>
-      </w:pPr>
-      <w:r>
-        <w:t xml:space="preserve"># </w:t>
-      </w:r>
-      <w:r>
-        <w:t>apt install php-mongodb</w:t>
-      </w:r>
-    </w:p>
-    <w:p>
-      <w:pPr>
-        <w:pStyle w:val="code"/>
-      </w:pPr>
+        <w:drawing>
+          <wp:inline distT="0" distB="0" distL="0" distR="0" wp14:anchorId="67784BF1" wp14:editId="6831C731">
+            <wp:extent cx="5943600" cy="1134745"/>
+            <wp:effectExtent l="0" t="0" r="0" b="0"/>
+            <wp:docPr id="885035499" name="Picture 1"/>
+            <wp:cNvGraphicFramePr>
+              <a:graphicFrameLocks xmlns:a="http://schemas.openxmlformats.org/drawingml/2006/main" noChangeAspect="1"/>
+            </wp:cNvGraphicFramePr>
+            <a:graphic xmlns:a="http://schemas.openxmlformats.org/drawingml/2006/main">
+              <a:graphicData uri="http://schemas.openxmlformats.org/drawingml/2006/picture">
+                <pic:pic xmlns:pic="http://schemas.openxmlformats.org/drawingml/2006/picture">
+                  <pic:nvPicPr>
+                    <pic:cNvPr id="885035499" name=""/>
+                    <pic:cNvPicPr/>
+                  </pic:nvPicPr>
+                  <pic:blipFill>
+                    <a:blip r:embed="rId6"/>
+                    <a:stretch>
+                      <a:fillRect/>
+                    </a:stretch>
+                  </pic:blipFill>
+                  <pic:spPr>
+                    <a:xfrm>
+                      <a:off x="0" y="0"/>
+                      <a:ext cx="5943600" cy="1134745"/>
+                    </a:xfrm>
+                    <a:prstGeom prst="rect">
+                      <a:avLst/>
+                    </a:prstGeom>
+                  </pic:spPr>
+                </pic:pic>
+              </a:graphicData>
+            </a:graphic>
+          </wp:inline>
+        </w:drawing>
+      </w:r>
     </w:p>
     <w:sectPr>
       <w:pgSz w:w="12240" w:h="15840"/>
@@ -1044,7 +938,7 @@
 </file>
 
 <file path=word/numbering.xml><?xml version="1.0" encoding="utf-8"?>
-<w:numbering xmlns:wpc="http://schemas.microsoft.com/office/word/2010/wordprocessingCanvas" xmlns:cx="http://schemas.microsoft.com/office/drawing/2014/chartex" xmlns:cx1="http://schemas.microsoft.com/office/drawing/2015/9/8/chartex" xmlns:cx2="http://schemas.microsoft.com/office/drawing/2015/10/21/chartex" xmlns:cx3="http://schemas.microsoft.com/office/drawing/2016/5/9/chartex" xmlns:cx4="http://schemas.microsoft.com/office/drawing/2016/5/10/chartex" xmlns:cx5="http://schemas.microsoft.com/office/drawing/2016/5/11/chartex" xmlns:cx6="http://schemas.microsoft.com/office/drawing/2016/5/12/chartex" xmlns:cx7="http://schemas.microsoft.com/office/drawing/2016/5/13/chartex" xmlns:cx8="http://schemas.microsoft.com/office/drawing/2016/5/14/chartex" xmlns:mc="http://schemas.openxmlformats.org/markup-compatibility/2006" xmlns:aink="http://schemas.microsoft.com/office/drawing/2016/ink" xmlns:am3d="http://schemas.microsoft.com/office/drawing/2017/model3d" xmlns:o="urn:schemas-microsoft-com:office:office" xmlns:oel="http://schemas.microsoft.com/office/2019/extlst" xmlns:r="http://schemas.openxmlformats.org/officeDocument/2006/relationships" xmlns:m="http://schemas.openxmlformats.org/officeDocument/2006/math" xmlns:v="urn:schemas-microsoft-com:vml" xmlns:wp14="http://schemas.microsoft.com/office/word/2010/wordprocessingDrawing" xmlns:wp="http://schemas.openxmlformats.org/drawingml/2006/wordprocessingDrawing" xmlns:w10="urn:schemas-microsoft-com:office:word" xmlns:w="http://schemas.openxmlformats.org/wordprocessingml/2006/main" xmlns:w14="http://schemas.microsoft.com/office/word/2010/wordml" xmlns:w15="http://schemas.microsoft.com/office/word/2012/wordml" xmlns:w16cex="http://schemas.microsoft.com/office/word/2018/wordml/cex" xmlns:w16cid="http://schemas.microsoft.com/office/word/2016/wordml/cid" xmlns:w16="http://schemas.microsoft.com/office/word/2018/wordml" xmlns:w16du="http://schemas.microsoft.com/office/word/2023/wordml/word16du" xmlns:w16sdtdh="http://schemas.microsoft.com/office/word/2020/wordml/sdtdatahash" xmlns:w16sdtfl="http://schemas.microsoft.com/office/word/2024/wordml/sdtformatlock" xmlns:w16se="http://schemas.microsoft.com/office/word/2015/wordml/symex" xmlns:wpg="http://schemas.microsoft.com/office/word/2010/wordprocessingGroup" xmlns:wpi="http://schemas.microsoft.com/office/word/2010/wordprocessingInk" xmlns:wne="http://schemas.microsoft.com/office/word/2006/wordml" xmlns:wps="http://schemas.microsoft.com/office/word/2010/wordprocessingShape" mc:Ignorable="w14 w15 w16se w16cid w16 w16cex w16sdtdh w16sdtfl w16du wp14">
+<w:numbering xmlns:wpc="http://schemas.microsoft.com/office/word/2010/wordprocessingCanvas" xmlns:cx="http://schemas.microsoft.com/office/drawing/2014/chartex" xmlns:cx1="http://schemas.microsoft.com/office/drawing/2015/9/8/chartex" xmlns:cx2="http://schemas.microsoft.com/office/drawing/2015/10/21/chartex" xmlns:cx3="http://schemas.microsoft.com/office/drawing/2016/5/9/chartex" xmlns:cx4="http://schemas.microsoft.com/office/drawing/2016/5/10/chartex" xmlns:cx5="http://schemas.microsoft.com/office/drawing/2016/5/11/chartex" xmlns:cx6="http://schemas.microsoft.com/office/drawing/2016/5/12/chartex" xmlns:cx7="http://schemas.microsoft.com/office/drawing/2016/5/13/chartex" xmlns:cx8="http://schemas.microsoft.com/office/drawing/2016/5/14/chartex" xmlns:mc="http://schemas.openxmlformats.org/markup-compatibility/2006" xmlns:aink="http://schemas.microsoft.com/office/drawing/2016/ink" xmlns:am3d="http://schemas.microsoft.com/office/drawing/2017/model3d" xmlns:o="urn:schemas-microsoft-com:office:office" xmlns:oel="http://schemas.microsoft.com/office/2019/extlst" xmlns:r="http://schemas.openxmlformats.org/officeDocument/2006/relationships" xmlns:m="http://schemas.openxmlformats.org/officeDocument/2006/math" xmlns:v="urn:schemas-microsoft-com:vml" xmlns:wp14="http://schemas.microsoft.com/office/word/2010/wordprocessingDrawing" xmlns:wp="http://schemas.openxmlformats.org/drawingml/2006/wordprocessingDrawing" xmlns:w10="urn:schemas-microsoft-com:office:word" xmlns:w="http://schemas.openxmlformats.org/wordprocessingml/2006/main" xmlns:w14="http://schemas.microsoft.com/office/word/2010/wordml" xmlns:w15="http://schemas.microsoft.com/office/word/2012/wordml" xmlns:w16cei="http://schemas.microsoft.com/office/word/2026/wordml/cei" xmlns:w16cex="http://schemas.microsoft.com/office/word/2018/wordml/cex" xmlns:w16cid="http://schemas.microsoft.com/office/word/2016/wordml/cid" xmlns:w16="http://schemas.microsoft.com/office/word/2018/wordml" xmlns:w16du="http://schemas.microsoft.com/office/word/2023/wordml/word16du" xmlns:w16sdtdh="http://schemas.microsoft.com/office/word/2020/wordml/sdtdatahash" xmlns:w16sdtfl="http://schemas.microsoft.com/office/word/2024/wordml/sdtformatlock" xmlns:w16se="http://schemas.microsoft.com/office/word/2015/wordml/symex" xmlns:wpg="http://schemas.microsoft.com/office/word/2010/wordprocessingGroup" xmlns:wpi="http://schemas.microsoft.com/office/word/2010/wordprocessingInk" xmlns:wne="http://schemas.microsoft.com/office/word/2006/wordml" xmlns:wps="http://schemas.microsoft.com/office/word/2010/wordprocessingShape" mc:Ignorable="w14 w15 w16se w16cid w16 w16cex w16sdtdh w16sdtfl w16du wp14">
   <w:abstractNum w:abstractNumId="0" w15:restartNumberingAfterBreak="0">
     <w:nsid w:val="0B3B798F"/>
     <w:multiLevelType w:val="hybridMultilevel"/>

</xml_diff>

<commit_message>
Step by step now has a working installer for Mongodb - now you can copy paste
</commit_message>
<xml_diff>
--- a/Step-by-step.docx
+++ b/Step-by-step.docx
@@ -890,41 +890,121 @@
         <w:pStyle w:val="code"/>
       </w:pPr>
       <w:r>
-        <w:drawing>
-          <wp:inline distT="0" distB="0" distL="0" distR="0" wp14:anchorId="67784BF1" wp14:editId="6831C731">
-            <wp:extent cx="5943600" cy="1134745"/>
-            <wp:effectExtent l="0" t="0" r="0" b="0"/>
-            <wp:docPr id="885035499" name="Picture 1"/>
-            <wp:cNvGraphicFramePr>
-              <a:graphicFrameLocks xmlns:a="http://schemas.openxmlformats.org/drawingml/2006/main" noChangeAspect="1"/>
-            </wp:cNvGraphicFramePr>
-            <a:graphic xmlns:a="http://schemas.openxmlformats.org/drawingml/2006/main">
-              <a:graphicData uri="http://schemas.openxmlformats.org/drawingml/2006/picture">
-                <pic:pic xmlns:pic="http://schemas.openxmlformats.org/drawingml/2006/picture">
-                  <pic:nvPicPr>
-                    <pic:cNvPr id="885035499" name=""/>
-                    <pic:cNvPicPr/>
-                  </pic:nvPicPr>
-                  <pic:blipFill>
-                    <a:blip r:embed="rId6"/>
-                    <a:stretch>
-                      <a:fillRect/>
-                    </a:stretch>
-                  </pic:blipFill>
-                  <pic:spPr>
-                    <a:xfrm>
-                      <a:off x="0" y="0"/>
-                      <a:ext cx="5943600" cy="1134745"/>
-                    </a:xfrm>
-                    <a:prstGeom prst="rect">
-                      <a:avLst/>
-                    </a:prstGeom>
-                  </pic:spPr>
-                </pic:pic>
-              </a:graphicData>
-            </a:graphic>
-          </wp:inline>
-        </w:drawing>
+        <w:t xml:space="preserve">$ </w:t>
+      </w:r>
+      <w:r>
+        <w:t xml:space="preserve">sudo apt update &amp;&amp; </w:t>
+      </w:r>
+    </w:p>
+    <w:p>
+      <w:pPr>
+        <w:pStyle w:val="code"/>
+      </w:pPr>
+      <w:r>
+        <w:t xml:space="preserve">$ </w:t>
+      </w:r>
+      <w:r>
+        <w:t xml:space="preserve">sudo apt upgrade -y &amp;&amp; </w:t>
+      </w:r>
+    </w:p>
+    <w:p>
+      <w:pPr>
+        <w:pStyle w:val="code"/>
+      </w:pPr>
+      <w:r>
+        <w:t xml:space="preserve">$ </w:t>
+      </w:r>
+      <w:r>
+        <w:t xml:space="preserve">sudo apt install -y gnupg curl &amp;&amp; </w:t>
+      </w:r>
+    </w:p>
+    <w:p>
+      <w:pPr>
+        <w:pStyle w:val="code"/>
+      </w:pPr>
+      <w:r>
+        <w:t xml:space="preserve">$ </w:t>
+      </w:r>
+      <w:r>
+        <w:t xml:space="preserve">curl -fsSL https://pgp.mongodb.com/server-8.0.asc | </w:t>
+      </w:r>
+    </w:p>
+    <w:p>
+      <w:pPr>
+        <w:pStyle w:val="code"/>
+      </w:pPr>
+      <w:r>
+        <w:t xml:space="preserve">$ </w:t>
+      </w:r>
+      <w:r>
+        <w:t xml:space="preserve">sudo gpg --dearmor -o /usr/share/keyrings/mongodb-server-8.0.gpg &amp;&amp; </w:t>
+      </w:r>
+    </w:p>
+    <w:p>
+      <w:pPr>
+        <w:pStyle w:val="code"/>
+      </w:pPr>
+      <w:r>
+        <w:t xml:space="preserve">$ </w:t>
+      </w:r>
+      <w:r>
+        <w:t>echo "deb [ signed-by=/usr/share/keyrings/mongodb-server-8.0.gpg ] https://repo.mongodb.org/apt/ubuntu noble/mongodb-org/8.0 multiverse"</w:t>
+      </w:r>
+    </w:p>
+    <w:p>
+      <w:pPr>
+        <w:pStyle w:val="code"/>
+      </w:pPr>
+      <w:r>
+        <w:t xml:space="preserve">$ </w:t>
+      </w:r>
+      <w:r>
+        <w:t xml:space="preserve">sudo tee /etc/apt/sources.list.d/mongodb-org-8.0.list &gt; /dev/null &amp;&amp; </w:t>
+      </w:r>
+    </w:p>
+    <w:p>
+      <w:pPr>
+        <w:pStyle w:val="code"/>
+      </w:pPr>
+      <w:r>
+        <w:t xml:space="preserve">$ </w:t>
+      </w:r>
+      <w:r>
+        <w:t xml:space="preserve">sudo apt update &amp;&amp; </w:t>
+      </w:r>
+    </w:p>
+    <w:p>
+      <w:pPr>
+        <w:pStyle w:val="code"/>
+      </w:pPr>
+      <w:r>
+        <w:t xml:space="preserve">$ </w:t>
+      </w:r>
+      <w:r>
+        <w:t xml:space="preserve">sudo apt install -y mongodb-org &amp;&amp; </w:t>
+      </w:r>
+    </w:p>
+    <w:p>
+      <w:pPr>
+        <w:pStyle w:val="code"/>
+      </w:pPr>
+      <w:r>
+        <w:t xml:space="preserve">$ </w:t>
+      </w:r>
+      <w:r>
+        <w:t xml:space="preserve">sudo systemctl enable --now mongod &amp;&amp; </w:t>
+      </w:r>
+    </w:p>
+    <w:p>
+      <w:pPr>
+        <w:pStyle w:val="code"/>
+      </w:pPr>
+      <w:r>
+        <w:lastRenderedPageBreak/>
+        <w:t xml:space="preserve">$ </w:t>
+      </w:r>
+      <w:r>
+        <w:t>sudo systemctl status mongod --no-pager</w:t>
       </w:r>
     </w:p>
     <w:sectPr>

</xml_diff>